<commit_message>
Documentar la URL de GitHub en los manuales Windows y la referencia rapida.
</commit_message>
<xml_diff>
--- a/docs/Manuales_Windows/01_Manual_de_Instalacion.docx
+++ b/docs/Manuales_Windows/01_Manual_de_Instalacion.docx
@@ -34,7 +34,195 @@
           <w:rFonts w:ascii="Calibri" w:hAnsi="Calibri" w:eastAsia="Calibri"/>
           <w:color w:val="000000"/>
         </w:rPr>
-        <w:t>1. Que vas a instalar</w:t>
+        <w:t>1. Repositorio en GitHub</w:t>
+      </w:r>
+    </w:p>
+    <w:tbl>
+      <w:tblPr>
+        <w:tblStyle w:val="TableGrid"/>
+        <w:tblW w:type="auto" w:w="0"/>
+        <w:tblLook w:firstColumn="1" w:firstRow="1" w:lastColumn="0" w:lastRow="0" w:noHBand="0" w:noVBand="1" w:val="04A0"/>
+      </w:tblPr>
+      <w:tblGrid>
+        <w:gridCol w:w="4986"/>
+        <w:gridCol w:w="4986"/>
+      </w:tblGrid>
+      <w:tr>
+        <w:tc>
+          <w:tcPr>
+            <w:tcW w:type="dxa" w:w="4986"/>
+            <w:shd w:fill="EEEEEE" w:val="clear"/>
+          </w:tcPr>
+          <w:p>
+            <w:r>
+              <w:rPr>
+                <w:rFonts w:ascii="Calibri" w:hAnsi="Calibri" w:eastAsia="Calibri"/>
+                <w:b/>
+                <w:color w:val="000000"/>
+              </w:rPr>
+              <w:t>Dato</w:t>
+            </w:r>
+          </w:p>
+        </w:tc>
+        <w:tc>
+          <w:tcPr>
+            <w:tcW w:type="dxa" w:w="4986"/>
+            <w:shd w:fill="EEEEEE" w:val="clear"/>
+          </w:tcPr>
+          <w:p>
+            <w:r>
+              <w:rPr>
+                <w:rFonts w:ascii="Calibri" w:hAnsi="Calibri" w:eastAsia="Calibri"/>
+                <w:b/>
+                <w:color w:val="000000"/>
+              </w:rPr>
+              <w:t>Valor</w:t>
+            </w:r>
+          </w:p>
+        </w:tc>
+      </w:tr>
+      <w:tr>
+        <w:tc>
+          <w:tcPr>
+            <w:tcW w:type="dxa" w:w="4986"/>
+          </w:tcPr>
+          <w:p>
+            <w:r>
+              <w:rPr>
+                <w:rFonts w:ascii="Calibri" w:hAnsi="Calibri" w:eastAsia="Calibri"/>
+                <w:color w:val="000000"/>
+              </w:rPr>
+              <w:t>URL del proyecto</w:t>
+            </w:r>
+          </w:p>
+        </w:tc>
+        <w:tc>
+          <w:tcPr>
+            <w:tcW w:type="dxa" w:w="4986"/>
+          </w:tcPr>
+          <w:p>
+            <w:r>
+              <w:rPr>
+                <w:rFonts w:ascii="Calibri" w:hAnsi="Calibri" w:eastAsia="Calibri"/>
+                <w:color w:val="000000"/>
+              </w:rPr>
+              <w:t>https://github.com/Atzelcer/Nexum_AI</w:t>
+            </w:r>
+          </w:p>
+        </w:tc>
+      </w:tr>
+      <w:tr>
+        <w:tc>
+          <w:tcPr>
+            <w:tcW w:type="dxa" w:w="4986"/>
+          </w:tcPr>
+          <w:p>
+            <w:r>
+              <w:rPr>
+                <w:rFonts w:ascii="Calibri" w:hAnsi="Calibri" w:eastAsia="Calibri"/>
+                <w:color w:val="000000"/>
+              </w:rPr>
+              <w:t>Clonar con Git</w:t>
+            </w:r>
+          </w:p>
+        </w:tc>
+        <w:tc>
+          <w:tcPr>
+            <w:tcW w:type="dxa" w:w="4986"/>
+          </w:tcPr>
+          <w:p>
+            <w:r>
+              <w:rPr>
+                <w:rFonts w:ascii="Calibri" w:hAnsi="Calibri" w:eastAsia="Calibri"/>
+                <w:color w:val="000000"/>
+              </w:rPr>
+              <w:t>git clone https://github.com/Atzelcer/Nexum_AI.git</w:t>
+            </w:r>
+          </w:p>
+        </w:tc>
+      </w:tr>
+      <w:tr>
+        <w:tc>
+          <w:tcPr>
+            <w:tcW w:type="dxa" w:w="4986"/>
+          </w:tcPr>
+          <w:p>
+            <w:r>
+              <w:rPr>
+                <w:rFonts w:ascii="Calibri" w:hAnsi="Calibri" w:eastAsia="Calibri"/>
+                <w:color w:val="000000"/>
+              </w:rPr>
+              <w:t>Rama principal</w:t>
+            </w:r>
+          </w:p>
+        </w:tc>
+        <w:tc>
+          <w:tcPr>
+            <w:tcW w:type="dxa" w:w="4986"/>
+          </w:tcPr>
+          <w:p>
+            <w:r>
+              <w:rPr>
+                <w:rFonts w:ascii="Calibri" w:hAnsi="Calibri" w:eastAsia="Calibri"/>
+                <w:color w:val="000000"/>
+              </w:rPr>
+              <w:t>main</w:t>
+            </w:r>
+          </w:p>
+        </w:tc>
+      </w:tr>
+      <w:tr>
+        <w:tc>
+          <w:tcPr>
+            <w:tcW w:type="dxa" w:w="4986"/>
+          </w:tcPr>
+          <w:p>
+            <w:r>
+              <w:rPr>
+                <w:rFonts w:ascii="Calibri" w:hAnsi="Calibri" w:eastAsia="Calibri"/>
+                <w:color w:val="000000"/>
+              </w:rPr>
+              <w:t>Autor / cuenta</w:t>
+            </w:r>
+          </w:p>
+        </w:tc>
+        <w:tc>
+          <w:tcPr>
+            <w:tcW w:type="dxa" w:w="4986"/>
+          </w:tcPr>
+          <w:p>
+            <w:r>
+              <w:rPr>
+                <w:rFonts w:ascii="Calibri" w:hAnsi="Calibri" w:eastAsia="Calibri"/>
+                <w:color w:val="000000"/>
+              </w:rPr>
+              <w:t>Atzelcer</w:t>
+            </w:r>
+          </w:p>
+        </w:tc>
+      </w:tr>
+    </w:tbl>
+    <w:p/>
+    <w:p>
+      <w:r>
+        <w:rPr>
+          <w:rFonts w:ascii="Calibri" w:hAnsi="Calibri" w:eastAsia="Calibri"/>
+          <w:color w:val="000000"/>
+          <w:sz w:val="22"/>
+        </w:rPr>
+        <w:t>Tambien puedes descargar el ZIP desde GitHub (Code → Download ZIP) o usar la carpeta 02_Codigo_fuente de la entrega NEXUM_ENTREGA.</w:t>
+      </w:r>
+    </w:p>
+    <w:p>
+      <w:pPr>
+        <w:pStyle w:val="Heading1"/>
+      </w:pPr>
+      <w:r>
+        <w:rPr>
+          <w:rFonts w:ascii="Calibri" w:hAnsi="Calibri" w:eastAsia="Calibri"/>
+          <w:color w:val="000000"/>
+        </w:rPr>
+        <w:t>2. Que vas a instalar</w:t>
       </w:r>
     </w:p>
     <w:tbl>
@@ -272,7 +460,7 @@
           <w:rFonts w:ascii="Calibri" w:hAnsi="Calibri" w:eastAsia="Calibri"/>
           <w:color w:val="000000"/>
         </w:rPr>
-        <w:t>2. Requisitos</w:t>
+        <w:t>3. Requisitos</w:t>
       </w:r>
     </w:p>
     <w:tbl>
@@ -499,6 +687,36 @@
           </w:p>
         </w:tc>
       </w:tr>
+      <w:tr>
+        <w:tc>
+          <w:tcPr>
+            <w:tcW w:type="dxa" w:w="4986"/>
+          </w:tcPr>
+          <w:p>
+            <w:r>
+              <w:rPr>
+                <w:rFonts w:ascii="Calibri" w:hAnsi="Calibri" w:eastAsia="Calibri"/>
+                <w:color w:val="000000"/>
+              </w:rPr>
+              <w:t>Git (opcional)</w:t>
+            </w:r>
+          </w:p>
+        </w:tc>
+        <w:tc>
+          <w:tcPr>
+            <w:tcW w:type="dxa" w:w="4986"/>
+          </w:tcPr>
+          <w:p>
+            <w:r>
+              <w:rPr>
+                <w:rFonts w:ascii="Calibri" w:hAnsi="Calibri" w:eastAsia="Calibri"/>
+                <w:color w:val="000000"/>
+              </w:rPr>
+              <w:t>Para clonar desde GitHub</w:t>
+            </w:r>
+          </w:p>
+        </w:tc>
+      </w:tr>
     </w:tbl>
     <w:p/>
     <w:p>
@@ -510,17 +728,7 @@
           <w:rFonts w:ascii="Calibri" w:hAnsi="Calibri" w:eastAsia="Calibri"/>
           <w:color w:val="000000"/>
         </w:rPr>
-        <w:t>3. Preparacion (una sola vez)</w:t>
-      </w:r>
-    </w:p>
-    <w:p>
-      <w:r>
-        <w:rPr>
-          <w:rFonts w:ascii="Calibri" w:hAnsi="Calibri" w:eastAsia="Calibri"/>
-          <w:color w:val="000000"/>
-          <w:sz w:val="22"/>
-        </w:rPr>
-        <w:t>Abrir PowerShell o Git Bash en la carpeta raiz del proyecto NEXUM_AI.</w:t>
+        <w:t>4. Preparacion (una sola vez)</w:t>
       </w:r>
     </w:p>
     <w:p>
@@ -532,7 +740,165 @@
           <w:rFonts w:ascii="Calibri" w:hAnsi="Calibri" w:eastAsia="Calibri"/>
           <w:color w:val="000000"/>
         </w:rPr>
-        <w:t>3.1 Entorno Python</w:t>
+        <w:t>4.0 Obtener el codigo</w:t>
+      </w:r>
+    </w:p>
+    <w:tbl>
+      <w:tblPr>
+        <w:tblStyle w:val="TableGrid"/>
+        <w:tblW w:type="auto" w:w="0"/>
+        <w:tblLook w:firstColumn="1" w:firstRow="1" w:lastColumn="0" w:lastRow="0" w:noHBand="0" w:noVBand="1" w:val="04A0"/>
+      </w:tblPr>
+      <w:tblGrid>
+        <w:gridCol w:w="4986"/>
+        <w:gridCol w:w="4986"/>
+      </w:tblGrid>
+      <w:tr>
+        <w:tc>
+          <w:tcPr>
+            <w:tcW w:type="dxa" w:w="4986"/>
+            <w:shd w:fill="EEEEEE" w:val="clear"/>
+          </w:tcPr>
+          <w:p>
+            <w:r>
+              <w:rPr>
+                <w:rFonts w:ascii="Calibri" w:hAnsi="Calibri" w:eastAsia="Calibri"/>
+                <w:b/>
+                <w:color w:val="000000"/>
+              </w:rPr>
+              <w:t>Paso</w:t>
+            </w:r>
+          </w:p>
+        </w:tc>
+        <w:tc>
+          <w:tcPr>
+            <w:tcW w:type="dxa" w:w="4986"/>
+            <w:shd w:fill="EEEEEE" w:val="clear"/>
+          </w:tcPr>
+          <w:p>
+            <w:r>
+              <w:rPr>
+                <w:rFonts w:ascii="Calibri" w:hAnsi="Calibri" w:eastAsia="Calibri"/>
+                <w:b/>
+                <w:color w:val="000000"/>
+              </w:rPr>
+              <w:t>Comando / accion</w:t>
+            </w:r>
+          </w:p>
+        </w:tc>
+      </w:tr>
+      <w:tr>
+        <w:tc>
+          <w:tcPr>
+            <w:tcW w:type="dxa" w:w="4986"/>
+          </w:tcPr>
+          <w:p>
+            <w:r>
+              <w:rPr>
+                <w:rFonts w:ascii="Calibri" w:hAnsi="Calibri" w:eastAsia="Calibri"/>
+                <w:color w:val="000000"/>
+              </w:rPr>
+              <w:t>1</w:t>
+            </w:r>
+          </w:p>
+        </w:tc>
+        <w:tc>
+          <w:tcPr>
+            <w:tcW w:type="dxa" w:w="4986"/>
+          </w:tcPr>
+          <w:p>
+            <w:r>
+              <w:rPr>
+                <w:rFonts w:ascii="Calibri" w:hAnsi="Calibri" w:eastAsia="Calibri"/>
+                <w:color w:val="000000"/>
+              </w:rPr>
+              <w:t>git clone https://github.com/Atzelcer/Nexum_AI.git</w:t>
+            </w:r>
+          </w:p>
+        </w:tc>
+      </w:tr>
+      <w:tr>
+        <w:tc>
+          <w:tcPr>
+            <w:tcW w:type="dxa" w:w="4986"/>
+          </w:tcPr>
+          <w:p>
+            <w:r>
+              <w:rPr>
+                <w:rFonts w:ascii="Calibri" w:hAnsi="Calibri" w:eastAsia="Calibri"/>
+                <w:color w:val="000000"/>
+              </w:rPr>
+              <w:t>2</w:t>
+            </w:r>
+          </w:p>
+        </w:tc>
+        <w:tc>
+          <w:tcPr>
+            <w:tcW w:type="dxa" w:w="4986"/>
+          </w:tcPr>
+          <w:p>
+            <w:r>
+              <w:rPr>
+                <w:rFonts w:ascii="Calibri" w:hAnsi="Calibri" w:eastAsia="Calibri"/>
+                <w:color w:val="000000"/>
+              </w:rPr>
+              <w:t>cd Nexum_AI</w:t>
+            </w:r>
+          </w:p>
+        </w:tc>
+      </w:tr>
+      <w:tr>
+        <w:tc>
+          <w:tcPr>
+            <w:tcW w:type="dxa" w:w="4986"/>
+          </w:tcPr>
+          <w:p>
+            <w:r>
+              <w:rPr>
+                <w:rFonts w:ascii="Calibri" w:hAnsi="Calibri" w:eastAsia="Calibri"/>
+                <w:color w:val="000000"/>
+              </w:rPr>
+              <w:t>3</w:t>
+            </w:r>
+          </w:p>
+        </w:tc>
+        <w:tc>
+          <w:tcPr>
+            <w:tcW w:type="dxa" w:w="4986"/>
+          </w:tcPr>
+          <w:p>
+            <w:r>
+              <w:rPr>
+                <w:rFonts w:ascii="Calibri" w:hAnsi="Calibri" w:eastAsia="Calibri"/>
+                <w:color w:val="000000"/>
+              </w:rPr>
+              <w:t>O usar NEXUM_ENTREGA\02_Codigo_fuente si viene en la entrega</w:t>
+            </w:r>
+          </w:p>
+        </w:tc>
+      </w:tr>
+    </w:tbl>
+    <w:p/>
+    <w:p>
+      <w:r>
+        <w:rPr>
+          <w:rFonts w:ascii="Calibri" w:hAnsi="Calibri" w:eastAsia="Calibri"/>
+          <w:color w:val="000000"/>
+          <w:sz w:val="22"/>
+        </w:rPr>
+        <w:t>Abrir PowerShell o Git Bash en la carpeta raiz del proyecto.</w:t>
+      </w:r>
+    </w:p>
+    <w:p>
+      <w:pPr>
+        <w:pStyle w:val="Heading2"/>
+      </w:pPr>
+      <w:r>
+        <w:rPr>
+          <w:rFonts w:ascii="Calibri" w:hAnsi="Calibri" w:eastAsia="Calibri"/>
+          <w:color w:val="000000"/>
+        </w:rPr>
+        <w:t>4.1 Entorno Python</w:t>
       </w:r>
     </w:p>
     <w:tbl>
@@ -710,7 +1076,7 @@
           <w:rFonts w:ascii="Calibri" w:hAnsi="Calibri" w:eastAsia="Calibri"/>
           <w:color w:val="000000"/>
         </w:rPr>
-        <w:t>3.2 MongoDB</w:t>
+        <w:t>4.2 MongoDB</w:t>
       </w:r>
     </w:p>
     <w:tbl>
@@ -898,7 +1264,7 @@
           <w:rFonts w:ascii="Calibri" w:hAnsi="Calibri" w:eastAsia="Calibri"/>
           <w:color w:val="000000"/>
         </w:rPr>
-        <w:t>3.3 Firmware del guante (solo si es la primera carga)</w:t>
+        <w:t>4.3 Firmware del guante (solo si es la primera carga)</w:t>
       </w:r>
     </w:p>
     <w:p>
@@ -920,7 +1286,7 @@
           <w:rFonts w:ascii="Calibri" w:hAnsi="Calibri" w:eastAsia="Calibri"/>
           <w:color w:val="000000"/>
         </w:rPr>
-        <w:t>3.4 Driver USB</w:t>
+        <w:t>4.4 Driver USB</w:t>
       </w:r>
     </w:p>
     <w:p>
@@ -942,7 +1308,7 @@
           <w:rFonts w:ascii="Calibri" w:hAnsi="Calibri" w:eastAsia="Calibri"/>
           <w:color w:val="000000"/>
         </w:rPr>
-        <w:t>4. Arranque diario</w:t>
+        <w:t>5. Arranque diario</w:t>
       </w:r>
     </w:p>
     <w:tbl>
@@ -1266,7 +1632,7 @@
           <w:rFonts w:ascii="Calibri" w:hAnsi="Calibri" w:eastAsia="Calibri"/>
           <w:color w:val="000000"/>
         </w:rPr>
-        <w:t>5. Primera comprobacion</w:t>
+        <w:t>6. Primera comprobacion</w:t>
       </w:r>
     </w:p>
     <w:p>
@@ -1530,7 +1896,7 @@
           <w:rFonts w:ascii="Calibri" w:hAnsi="Calibri" w:eastAsia="Calibri"/>
           <w:color w:val="000000"/>
         </w:rPr>
-        <w:t>6. Puertos usados</w:t>
+        <w:t>7. Puertos usados</w:t>
       </w:r>
     </w:p>
     <w:tbl>
@@ -1768,7 +2134,7 @@
           <w:rFonts w:ascii="Calibri" w:hAnsi="Calibri" w:eastAsia="Calibri"/>
           <w:color w:val="000000"/>
         </w:rPr>
-        <w:t>7. Apagado</w:t>
+        <w:t>8. Apagado</w:t>
       </w:r>
     </w:p>
     <w:p>
@@ -1779,6 +2145,28 @@
           <w:sz w:val="22"/>
         </w:rPr>
         <w:t>Cierra las pestanas del navegador y deten las dos terminales con Ctrl+C. MongoDB puede quedar como servicio de Windows.</w:t>
+      </w:r>
+    </w:p>
+    <w:p>
+      <w:pPr>
+        <w:pStyle w:val="Heading1"/>
+      </w:pPr>
+      <w:r>
+        <w:rPr>
+          <w:rFonts w:ascii="Calibri" w:hAnsi="Calibri" w:eastAsia="Calibri"/>
+          <w:color w:val="000000"/>
+        </w:rPr>
+        <w:t>9. Enlace permanente</w:t>
+      </w:r>
+    </w:p>
+    <w:p>
+      <w:r>
+        <w:rPr>
+          <w:rFonts w:ascii="Calibri" w:hAnsi="Calibri" w:eastAsia="Calibri"/>
+          <w:color w:val="000000"/>
+          <w:sz w:val="22"/>
+        </w:rPr>
+        <w:t>Codigo fuente y actualizaciones: https://github.com/Atzelcer/Nexum_AI</w:t>
       </w:r>
     </w:p>
     <w:sectPr>

</xml_diff>